<commit_message>
add juniper day one ospf labs
</commit_message>
<xml_diff>
--- a/jnciesproadmap/LAB-004/LAB-004_Solution-Guide.docx
+++ b/jnciesproadmap/LAB-004/LAB-004_Solution-Guide.docx
@@ -3486,7 +3486,52 @@
           <w:b w:val="0"/>
           <w:sz w:val="18"/>
         </w:rPr>
-        <w:t xml:space="preserve">1. Inspect the service route deeply enough to expose protocol and indirect next-hop fields.</w:t>
+        <w:t xml:space="preserve">1. Inspect the service route deeply enough to expose </w:t>
+      </w:r>
+      <w:r>
+        <w:rPr>
+          <w:rFonts w:ascii="Calibri" w:hAnsi="Calibri"/>
+          <w:b/>
+          <w:bCs/>
+          <w:color w:val="c00000"/>
+          <w:sz w:val="18"/>
+        </w:rPr>
+        <w:t xml:space="preserve">protocol next-hop</w:t>
+      </w:r>
+      <w:r>
+        <w:rPr>
+          <w:rFonts w:ascii="Calibri" w:hAnsi="Calibri"/>
+          <w:b/>
+          <w:bCs/>
+          <w:sz w:val="18"/>
+        </w:rPr>
+        <w:t xml:space="preserve"> </w:t>
+      </w:r>
+      <w:r>
+        <w:rPr>
+          <w:rFonts w:ascii="Calibri" w:hAnsi="Calibri"/>
+          <w:b w:val="0"/>
+          <w:sz w:val="18"/>
+        </w:rPr>
+        <w:t xml:space="preserve">and </w:t>
+      </w:r>
+      <w:r>
+        <w:rPr>
+          <w:rFonts w:ascii="Calibri" w:hAnsi="Calibri"/>
+          <w:b/>
+          <w:bCs/>
+          <w:color w:val="c00000"/>
+          <w:sz w:val="18"/>
+        </w:rPr>
+        <w:t xml:space="preserve">indirect next-hop</w:t>
+      </w:r>
+      <w:r>
+        <w:rPr>
+          <w:rFonts w:ascii="Calibri" w:hAnsi="Calibri"/>
+          <w:b w:val="0"/>
+          <w:sz w:val="18"/>
+        </w:rPr>
+        <w:t xml:space="preserve"> fields.</w:t>
       </w:r>
       <w:r/>
     </w:p>

</xml_diff>

<commit_message>
add more juniper day one ospf labs
</commit_message>
<xml_diff>
--- a/jnciesproadmap/LAB-004/LAB-004_Solution-Guide.docx
+++ b/jnciesproadmap/LAB-004/LAB-004_Solution-Guide.docx
@@ -3605,7 +3605,41 @@
           <w:b w:val="0"/>
           <w:sz w:val="18"/>
         </w:rPr>
-        <w:t xml:space="preserve">2. Compare the IGP and MPLS resolution candidates for the BGP protocol next hop.</w:t>
+        <w:t xml:space="preserve">2. Compare the </w:t>
+      </w:r>
+      <w:r>
+        <w:rPr>
+          <w:rFonts w:ascii="Calibri" w:hAnsi="Calibri"/>
+          <w:b/>
+          <w:bCs/>
+          <w:sz w:val="18"/>
+        </w:rPr>
+        <w:t xml:space="preserve">IGP </w:t>
+      </w:r>
+      <w:r>
+        <w:rPr>
+          <w:rFonts w:ascii="Calibri" w:hAnsi="Calibri"/>
+          <w:b w:val="0"/>
+          <w:sz w:val="18"/>
+        </w:rPr>
+        <w:t xml:space="preserve">and </w:t>
+      </w:r>
+      <w:r>
+        <w:rPr>
+          <w:rFonts w:ascii="Calibri" w:hAnsi="Calibri"/>
+          <w:b/>
+          <w:bCs/>
+          <w:sz w:val="18"/>
+        </w:rPr>
+        <w:t xml:space="preserve">MPLS </w:t>
+      </w:r>
+      <w:r>
+        <w:rPr>
+          <w:rFonts w:ascii="Calibri" w:hAnsi="Calibri"/>
+          <w:b w:val="0"/>
+          <w:sz w:val="18"/>
+        </w:rPr>
+        <w:t xml:space="preserve">resolution candidates for the BGP protocol next hop.</w:t>
       </w:r>
       <w:r/>
     </w:p>
@@ -3651,7 +3685,24 @@
               </w:rPr>
               <w:t xml:space="preserve">show route 10.255.4.4/32 exact detail</w:t>
               <w:br/>
-              <w:t xml:space="preserve">show route table inet.3 10.255.4.4/32 exact extensive</w:t>
+              <w:t xml:space="preserve">show route </w:t>
+            </w:r>
+            <w:r>
+              <w:rPr>
+                <w:rFonts w:ascii="Consolas" w:hAnsi="Consolas"/>
+                <w:b w:val="0"/>
+                <w:color w:val="ff0000"/>
+                <w:sz w:val="15"/>
+              </w:rPr>
+              <w:t xml:space="preserve">table inet.3</w:t>
+            </w:r>
+            <w:r>
+              <w:rPr>
+                <w:rFonts w:ascii="Consolas" w:hAnsi="Consolas"/>
+                <w:b w:val="0"/>
+                <w:sz w:val="15"/>
+              </w:rPr>
+              <w:t xml:space="preserve"> 10.255.4.4/32 exact extensive</w:t>
             </w:r>
             <w:r/>
           </w:p>

</xml_diff>